<commit_message>
fix: update word file
</commit_message>
<xml_diff>
--- a/Лабораторна робота 1.docx
+++ b/Лабораторна робота 1.docx
@@ -2982,31 +2982,39 @@
       <w:pPr>
         <w:spacing w:line="360" w:lineRule="auto"/>
         <w:rPr>
+          <w:b/>
+          <w:sz w:val="28"/>
+          <w:szCs w:val="28"/>
+        </w:rPr>
+      </w:pPr>
+      <w:proofErr w:type="spellStart"/>
+      <w:r>
+        <w:rPr>
+          <w:bCs/>
+          <w:sz w:val="28"/>
+          <w:szCs w:val="28"/>
+          <w:lang w:val="en-US"/>
+        </w:rPr>
+        <w:t>Github</w:t>
+      </w:r>
+      <w:proofErr w:type="spellEnd"/>
+      <w:r>
+        <w:rPr>
+          <w:bCs/>
+          <w:sz w:val="28"/>
+          <w:szCs w:val="28"/>
+          <w:lang w:val="ru-RU"/>
+        </w:rPr>
+        <w:t xml:space="preserve"> </w:t>
+      </w:r>
+      <w:r>
+        <w:rPr>
           <w:bCs/>
           <w:sz w:val="28"/>
           <w:szCs w:val="28"/>
           <w:lang w:val="uk-UA"/>
         </w:rPr>
-      </w:pPr>
-      <w:proofErr w:type="spellStart"/>
-      <w:r>
-        <w:rPr>
-          <w:bCs/>
-          <w:sz w:val="28"/>
-          <w:szCs w:val="28"/>
-          <w:lang w:val="en-US"/>
-        </w:rPr>
-        <w:t>Github</w:t>
-      </w:r>
-      <w:proofErr w:type="spellEnd"/>
-      <w:r>
-        <w:rPr>
-          <w:bCs/>
-          <w:sz w:val="28"/>
-          <w:szCs w:val="28"/>
-          <w:lang w:val="ru-RU"/>
-        </w:rPr>
-        <w:t xml:space="preserve"> </w:t>
+        <w:t xml:space="preserve">репозиторій - </w:t>
       </w:r>
       <w:r>
         <w:rPr>
@@ -3015,27 +3023,8 @@
           <w:szCs w:val="28"/>
           <w:lang w:val="uk-UA"/>
         </w:rPr>
-        <w:t xml:space="preserve">репозиторій - </w:t>
-      </w:r>
-      <w:r>
-        <w:rPr>
-          <w:bCs/>
-          <w:sz w:val="28"/>
-          <w:szCs w:val="28"/>
-          <w:lang w:val="uk-UA"/>
-        </w:rPr>
-        <w:t>https://github.com/kOnfie/software-methods-lab-1</w:t>
-      </w:r>
-    </w:p>
-    <w:p>
-      <w:pPr>
-        <w:spacing w:line="360" w:lineRule="auto"/>
-        <w:rPr>
-          <w:b/>
-          <w:sz w:val="28"/>
-          <w:szCs w:val="28"/>
-        </w:rPr>
-      </w:pPr>
+        <w:t>https://github.com/Denys-student/Denys-student-software-methods-lab-1</w:t>
+      </w:r>
     </w:p>
     <w:p>
       <w:pPr>
@@ -3054,6 +3043,752 @@
           <w:szCs w:val="28"/>
         </w:rPr>
         <w:t>Висновок:</w:t>
+      </w:r>
+    </w:p>
+    <w:p>
+      <w:pPr>
+        <w:spacing w:line="360" w:lineRule="auto"/>
+        <w:ind w:firstLine="567"/>
+        <w:rPr>
+          <w:sz w:val="28"/>
+          <w:szCs w:val="28"/>
+        </w:rPr>
+      </w:pPr>
+      <w:r>
+        <w:rPr>
+          <w:sz w:val="28"/>
+          <w:szCs w:val="28"/>
+          <w:lang w:val="uk-UA"/>
+        </w:rPr>
+        <w:t xml:space="preserve">Виконуючи цю роботу, я покращив знання </w:t>
+      </w:r>
+      <w:r>
+        <w:rPr>
+          <w:sz w:val="28"/>
+          <w:szCs w:val="28"/>
+          <w:lang w:val="uk-UA"/>
+        </w:rPr>
+        <w:t xml:space="preserve">про моделювання кінематики прямолінійного руху. Оскільки точка рухається у двовимірному просторі, використовуємо рівняння кінематики для знаходження координат. Тіло рухається з прискоренням під кутом, то з цього отримуємо рівняння руху для </w:t>
+      </w:r>
+      <w:r>
+        <w:rPr>
+          <w:sz w:val="28"/>
+          <w:szCs w:val="28"/>
+          <w:lang w:val="en-US"/>
+        </w:rPr>
+        <w:t>x</w:t>
+      </w:r>
+      <w:r>
+        <w:rPr>
+          <w:sz w:val="28"/>
+          <w:szCs w:val="28"/>
+          <w:lang w:val="uk-UA"/>
+        </w:rPr>
+        <w:t xml:space="preserve">, </w:t>
+      </w:r>
+      <w:r>
+        <w:rPr>
+          <w:sz w:val="28"/>
+          <w:szCs w:val="28"/>
+          <w:lang w:val="en-US"/>
+        </w:rPr>
+        <w:t>y</w:t>
+      </w:r>
+      <w:r>
+        <w:rPr>
+          <w:sz w:val="28"/>
+          <w:szCs w:val="28"/>
+          <w:lang w:val="uk-UA"/>
+        </w:rPr>
+        <w:t xml:space="preserve"> </w:t>
+      </w:r>
+      <w:r>
+        <w:rPr>
+          <w:sz w:val="28"/>
+          <w:szCs w:val="28"/>
+          <w:lang w:val="uk-UA"/>
+        </w:rPr>
+        <w:t>для кожного моменту часу</w:t>
+      </w:r>
+      <w:r>
+        <w:rPr>
+          <w:sz w:val="28"/>
+          <w:szCs w:val="28"/>
+          <w:lang w:val="uk-UA"/>
+        </w:rPr>
+        <w:t xml:space="preserve"> </w:t>
+      </w:r>
+      <w:r>
+        <w:rPr>
+          <w:sz w:val="28"/>
+          <w:szCs w:val="28"/>
+          <w:lang w:val="en-US"/>
+        </w:rPr>
+        <w:t>t</w:t>
+      </w:r>
+      <w:r>
+        <w:rPr>
+          <w:sz w:val="28"/>
+          <w:szCs w:val="28"/>
+          <w:lang w:val="uk-UA"/>
+        </w:rPr>
+        <w:t xml:space="preserve">. </w:t>
+      </w:r>
+      <w:r>
+        <w:rPr>
+          <w:sz w:val="28"/>
+          <w:szCs w:val="28"/>
+          <w:lang w:val="uk-UA"/>
+        </w:rPr>
+        <w:t xml:space="preserve">Кінцева формула для </w:t>
+      </w:r>
+      <w:r>
+        <w:rPr>
+          <w:b/>
+          <w:bCs/>
+          <w:sz w:val="28"/>
+          <w:szCs w:val="28"/>
+          <w:lang w:val="en-US"/>
+        </w:rPr>
+        <w:t>x</w:t>
+      </w:r>
+      <w:r>
+        <w:rPr>
+          <w:sz w:val="28"/>
+          <w:szCs w:val="28"/>
+          <w:lang w:val="uk-UA"/>
+        </w:rPr>
+        <w:t xml:space="preserve"> </w:t>
+      </w:r>
+      <w:r>
+        <w:rPr>
+          <w:sz w:val="28"/>
+          <w:szCs w:val="28"/>
+          <w:lang w:val="uk-UA"/>
+        </w:rPr>
+        <w:t>виглядає так</w:t>
+      </w:r>
+      <w:r>
+        <w:rPr>
+          <w:sz w:val="28"/>
+          <w:szCs w:val="28"/>
+          <w:lang w:val="uk-UA"/>
+        </w:rPr>
+        <w:t xml:space="preserve">: </w:t>
+      </w:r>
+      <w:r>
+        <w:rPr>
+          <w:rStyle w:val="mord"/>
+          <w:b/>
+          <w:bCs/>
+          <w:sz w:val="28"/>
+          <w:szCs w:val="28"/>
+        </w:rPr>
+        <w:t>x</w:t>
+      </w:r>
+      <w:r>
+        <w:rPr>
+          <w:rStyle w:val="mopen"/>
+          <w:b/>
+          <w:bCs/>
+          <w:sz w:val="28"/>
+          <w:szCs w:val="28"/>
+        </w:rPr>
+        <w:t>(</w:t>
+      </w:r>
+      <w:r>
+        <w:rPr>
+          <w:rStyle w:val="mord"/>
+          <w:b/>
+          <w:bCs/>
+          <w:sz w:val="28"/>
+          <w:szCs w:val="28"/>
+        </w:rPr>
+        <w:t>t</w:t>
+      </w:r>
+      <w:r>
+        <w:rPr>
+          <w:rStyle w:val="mclose"/>
+          <w:b/>
+          <w:bCs/>
+          <w:sz w:val="28"/>
+          <w:szCs w:val="28"/>
+        </w:rPr>
+        <w:t xml:space="preserve">) </w:t>
+      </w:r>
+      <w:r>
+        <w:rPr>
+          <w:rStyle w:val="mrel"/>
+          <w:b/>
+          <w:bCs/>
+          <w:sz w:val="28"/>
+          <w:szCs w:val="28"/>
+        </w:rPr>
+        <w:t xml:space="preserve">= </w:t>
+      </w:r>
+      <w:r>
+        <w:rPr>
+          <w:rStyle w:val="mord"/>
+          <w:b/>
+          <w:bCs/>
+          <w:sz w:val="28"/>
+          <w:szCs w:val="28"/>
+        </w:rPr>
+        <w:t>x</w:t>
+      </w:r>
+      <w:r>
+        <w:rPr>
+          <w:rStyle w:val="mord"/>
+          <w:b/>
+          <w:bCs/>
+          <w:sz w:val="28"/>
+          <w:szCs w:val="28"/>
+          <w:vertAlign w:val="subscript"/>
+        </w:rPr>
+        <w:t>0</w:t>
+      </w:r>
+      <w:r>
+        <w:rPr>
+          <w:rStyle w:val="mord"/>
+          <w:b/>
+          <w:bCs/>
+          <w:sz w:val="28"/>
+          <w:szCs w:val="28"/>
+        </w:rPr>
+        <w:t xml:space="preserve"> </w:t>
+      </w:r>
+      <w:r>
+        <w:rPr>
+          <w:rStyle w:val="vlist-s"/>
+          <w:b/>
+          <w:bCs/>
+          <w:sz w:val="28"/>
+          <w:szCs w:val="28"/>
+        </w:rPr>
+        <w:t>​</w:t>
+      </w:r>
+      <w:r>
+        <w:rPr>
+          <w:rStyle w:val="mbin"/>
+          <w:b/>
+          <w:bCs/>
+          <w:sz w:val="28"/>
+          <w:szCs w:val="28"/>
+        </w:rPr>
+        <w:t xml:space="preserve">+ </w:t>
+      </w:r>
+      <w:r>
+        <w:rPr>
+          <w:rStyle w:val="mord"/>
+          <w:b/>
+          <w:bCs/>
+          <w:sz w:val="28"/>
+          <w:szCs w:val="28"/>
+          <w:lang w:val="en-US"/>
+        </w:rPr>
+        <w:t>v</w:t>
+      </w:r>
+      <w:r>
+        <w:rPr>
+          <w:rStyle w:val="mord"/>
+          <w:b/>
+          <w:bCs/>
+          <w:sz w:val="28"/>
+          <w:szCs w:val="28"/>
+          <w:vertAlign w:val="subscript"/>
+          <w:lang w:val="uk-UA"/>
+        </w:rPr>
+        <w:t>0</w:t>
+      </w:r>
+      <w:r>
+        <w:rPr>
+          <w:rStyle w:val="mord"/>
+          <w:b/>
+          <w:bCs/>
+          <w:sz w:val="28"/>
+          <w:szCs w:val="28"/>
+          <w:lang w:val="uk-UA"/>
+        </w:rPr>
+        <w:t xml:space="preserve"> </w:t>
+      </w:r>
+      <w:r>
+        <w:rPr>
+          <w:rStyle w:val="mord"/>
+          <w:b/>
+          <w:bCs/>
+          <w:sz w:val="28"/>
+          <w:szCs w:val="28"/>
+          <w:lang w:val="en-US"/>
+        </w:rPr>
+        <w:t>cos</w:t>
+      </w:r>
+      <w:r>
+        <w:rPr>
+          <w:rStyle w:val="mord"/>
+          <w:b/>
+          <w:bCs/>
+          <w:sz w:val="28"/>
+          <w:szCs w:val="28"/>
+          <w:lang w:val="uk-UA"/>
+        </w:rPr>
+        <w:t>(</w:t>
+      </w:r>
+      <m:oMath>
+        <m:r>
+          <m:rPr>
+            <m:sty m:val="bi"/>
+          </m:rPr>
+          <w:rPr>
+            <w:rStyle w:val="mord"/>
+            <w:rFonts w:ascii="Cambria Math" w:hAnsi="Cambria Math"/>
+            <w:sz w:val="28"/>
+            <w:szCs w:val="28"/>
+            <w:lang w:val="en-US"/>
+          </w:rPr>
+          <m:t>α</m:t>
+        </m:r>
+      </m:oMath>
+      <w:r>
+        <w:rPr>
+          <w:rStyle w:val="mord"/>
+          <w:b/>
+          <w:bCs/>
+          <w:sz w:val="28"/>
+          <w:szCs w:val="28"/>
+          <w:lang w:val="uk-UA"/>
+        </w:rPr>
+        <w:t>)</w:t>
+      </w:r>
+      <w:r>
+        <w:rPr>
+          <w:rStyle w:val="mord"/>
+          <w:b/>
+          <w:bCs/>
+          <w:sz w:val="28"/>
+          <w:szCs w:val="28"/>
+        </w:rPr>
+        <w:t xml:space="preserve">t </w:t>
+      </w:r>
+      <w:r>
+        <w:rPr>
+          <w:rStyle w:val="mbin"/>
+          <w:b/>
+          <w:bCs/>
+          <w:sz w:val="28"/>
+          <w:szCs w:val="28"/>
+        </w:rPr>
+        <w:t xml:space="preserve">+ </w:t>
+      </w:r>
+      <w:r>
+        <w:rPr>
+          <w:rStyle w:val="mord"/>
+          <w:b/>
+          <w:bCs/>
+          <w:sz w:val="28"/>
+          <w:szCs w:val="28"/>
+        </w:rPr>
+        <w:t>1/2</w:t>
+      </w:r>
+      <w:r>
+        <w:rPr>
+          <w:b/>
+          <w:bCs/>
+          <w:sz w:val="28"/>
+          <w:szCs w:val="28"/>
+        </w:rPr>
+        <w:t xml:space="preserve"> a cos(</w:t>
+      </w:r>
+      <m:oMath>
+        <m:r>
+          <m:rPr>
+            <m:sty m:val="bi"/>
+          </m:rPr>
+          <w:rPr>
+            <w:rStyle w:val="mord"/>
+            <w:rFonts w:ascii="Cambria Math" w:hAnsi="Cambria Math"/>
+            <w:sz w:val="28"/>
+            <w:szCs w:val="28"/>
+            <w:lang w:val="en-US"/>
+          </w:rPr>
+          <m:t>α</m:t>
+        </m:r>
+        <m:r>
+          <m:rPr>
+            <m:sty m:val="bi"/>
+          </m:rPr>
+          <w:rPr>
+            <w:rStyle w:val="mord"/>
+            <w:rFonts w:ascii="Cambria Math" w:hAnsi="Cambria Math"/>
+            <w:sz w:val="28"/>
+            <w:szCs w:val="28"/>
+            <w:lang w:val="uk-UA"/>
+          </w:rPr>
+          <m:t>)</m:t>
+        </m:r>
+      </m:oMath>
+      <w:r>
+        <w:rPr>
+          <w:rStyle w:val="vlist-s"/>
+          <w:b/>
+          <w:bCs/>
+          <w:sz w:val="28"/>
+          <w:szCs w:val="28"/>
+        </w:rPr>
+        <w:t>​</w:t>
+      </w:r>
+      <w:r>
+        <w:rPr>
+          <w:rStyle w:val="mord"/>
+          <w:b/>
+          <w:bCs/>
+          <w:sz w:val="28"/>
+          <w:szCs w:val="28"/>
+        </w:rPr>
+        <w:t>t</w:t>
+      </w:r>
+      <w:r>
+        <w:rPr>
+          <w:rStyle w:val="mord"/>
+          <w:b/>
+          <w:bCs/>
+          <w:sz w:val="28"/>
+          <w:szCs w:val="28"/>
+          <w:vertAlign w:val="superscript"/>
+        </w:rPr>
+        <w:t>2</w:t>
+      </w:r>
+      <w:r>
+        <w:rPr>
+          <w:rStyle w:val="mord"/>
+          <w:b/>
+          <w:bCs/>
+          <w:sz w:val="36"/>
+          <w:szCs w:val="36"/>
+          <w:vertAlign w:val="superscript"/>
+        </w:rPr>
+        <w:t xml:space="preserve"> </w:t>
+      </w:r>
+      <w:r>
+        <w:rPr>
+          <w:sz w:val="28"/>
+          <w:szCs w:val="28"/>
+          <w:lang w:val="uk-UA"/>
+        </w:rPr>
+        <w:t xml:space="preserve">або для </w:t>
+      </w:r>
+      <w:r>
+        <w:rPr>
+          <w:b/>
+          <w:bCs/>
+          <w:sz w:val="28"/>
+          <w:szCs w:val="28"/>
+          <w:lang w:val="en-US"/>
+        </w:rPr>
+        <w:t>y</w:t>
+      </w:r>
+      <w:r>
+        <w:rPr>
+          <w:b/>
+          <w:bCs/>
+          <w:sz w:val="28"/>
+          <w:szCs w:val="28"/>
+          <w:lang w:val="uk-UA"/>
+        </w:rPr>
+        <w:t xml:space="preserve"> </w:t>
+      </w:r>
+      <w:r>
+        <w:rPr>
+          <w:sz w:val="28"/>
+          <w:szCs w:val="28"/>
+          <w:lang w:val="uk-UA"/>
+        </w:rPr>
+        <w:t>так</w:t>
+      </w:r>
+      <w:r>
+        <w:rPr>
+          <w:sz w:val="28"/>
+          <w:szCs w:val="28"/>
+          <w:lang w:val="uk-UA"/>
+        </w:rPr>
+        <w:t xml:space="preserve">: </w:t>
+      </w:r>
+      <w:r>
+        <w:rPr>
+          <w:rStyle w:val="mord"/>
+          <w:b/>
+          <w:bCs/>
+          <w:sz w:val="28"/>
+          <w:szCs w:val="28"/>
+        </w:rPr>
+        <w:t>y</w:t>
+      </w:r>
+      <w:r>
+        <w:rPr>
+          <w:rStyle w:val="mopen"/>
+          <w:b/>
+          <w:bCs/>
+          <w:sz w:val="28"/>
+          <w:szCs w:val="28"/>
+        </w:rPr>
+        <w:t>(</w:t>
+      </w:r>
+      <w:r>
+        <w:rPr>
+          <w:rStyle w:val="mord"/>
+          <w:b/>
+          <w:bCs/>
+          <w:sz w:val="28"/>
+          <w:szCs w:val="28"/>
+        </w:rPr>
+        <w:t>t</w:t>
+      </w:r>
+      <w:r>
+        <w:rPr>
+          <w:rStyle w:val="mclose"/>
+          <w:b/>
+          <w:bCs/>
+          <w:sz w:val="28"/>
+          <w:szCs w:val="28"/>
+        </w:rPr>
+        <w:t xml:space="preserve">) </w:t>
+      </w:r>
+      <w:r>
+        <w:rPr>
+          <w:rStyle w:val="mrel"/>
+          <w:b/>
+          <w:bCs/>
+          <w:sz w:val="28"/>
+          <w:szCs w:val="28"/>
+        </w:rPr>
+        <w:t>= y</w:t>
+      </w:r>
+      <w:r>
+        <w:rPr>
+          <w:rStyle w:val="mord"/>
+          <w:b/>
+          <w:bCs/>
+          <w:sz w:val="28"/>
+          <w:szCs w:val="28"/>
+          <w:vertAlign w:val="subscript"/>
+        </w:rPr>
+        <w:t>0</w:t>
+      </w:r>
+      <w:r>
+        <w:rPr>
+          <w:rStyle w:val="mord"/>
+          <w:b/>
+          <w:bCs/>
+          <w:sz w:val="28"/>
+          <w:szCs w:val="28"/>
+        </w:rPr>
+        <w:t xml:space="preserve"> </w:t>
+      </w:r>
+      <w:r>
+        <w:rPr>
+          <w:rStyle w:val="vlist-s"/>
+          <w:b/>
+          <w:bCs/>
+          <w:sz w:val="28"/>
+          <w:szCs w:val="28"/>
+        </w:rPr>
+        <w:t>​</w:t>
+      </w:r>
+      <w:r>
+        <w:rPr>
+          <w:rStyle w:val="mbin"/>
+          <w:b/>
+          <w:bCs/>
+          <w:sz w:val="28"/>
+          <w:szCs w:val="28"/>
+        </w:rPr>
+        <w:t xml:space="preserve">+ </w:t>
+      </w:r>
+      <w:r>
+        <w:rPr>
+          <w:rStyle w:val="mord"/>
+          <w:b/>
+          <w:bCs/>
+          <w:sz w:val="28"/>
+          <w:szCs w:val="28"/>
+          <w:lang w:val="en-US"/>
+        </w:rPr>
+        <w:t>v</w:t>
+      </w:r>
+      <w:r>
+        <w:rPr>
+          <w:rStyle w:val="mord"/>
+          <w:b/>
+          <w:bCs/>
+          <w:sz w:val="28"/>
+          <w:szCs w:val="28"/>
+          <w:vertAlign w:val="subscript"/>
+          <w:lang w:val="uk-UA"/>
+        </w:rPr>
+        <w:t>0</w:t>
+      </w:r>
+      <w:r>
+        <w:rPr>
+          <w:rStyle w:val="mord"/>
+          <w:b/>
+          <w:bCs/>
+          <w:sz w:val="28"/>
+          <w:szCs w:val="28"/>
+          <w:lang w:val="uk-UA"/>
+        </w:rPr>
+        <w:t xml:space="preserve"> </w:t>
+      </w:r>
+      <w:r>
+        <w:rPr>
+          <w:rStyle w:val="mord"/>
+          <w:b/>
+          <w:bCs/>
+          <w:sz w:val="28"/>
+          <w:szCs w:val="28"/>
+          <w:lang w:val="en-US"/>
+        </w:rPr>
+        <w:t>sin</w:t>
+      </w:r>
+      <w:r>
+        <w:rPr>
+          <w:rStyle w:val="mord"/>
+          <w:b/>
+          <w:bCs/>
+          <w:sz w:val="28"/>
+          <w:szCs w:val="28"/>
+          <w:lang w:val="uk-UA"/>
+        </w:rPr>
+        <w:t>(</w:t>
+      </w:r>
+      <m:oMath>
+        <m:r>
+          <m:rPr>
+            <m:sty m:val="bi"/>
+          </m:rPr>
+          <w:rPr>
+            <w:rStyle w:val="mord"/>
+            <w:rFonts w:ascii="Cambria Math" w:hAnsi="Cambria Math"/>
+            <w:sz w:val="28"/>
+            <w:szCs w:val="28"/>
+            <w:lang w:val="en-US"/>
+          </w:rPr>
+          <m:t>α</m:t>
+        </m:r>
+      </m:oMath>
+      <w:r>
+        <w:rPr>
+          <w:rStyle w:val="mord"/>
+          <w:b/>
+          <w:bCs/>
+          <w:sz w:val="28"/>
+          <w:szCs w:val="28"/>
+          <w:lang w:val="uk-UA"/>
+        </w:rPr>
+        <w:t>)</w:t>
+      </w:r>
+      <w:r>
+        <w:rPr>
+          <w:rStyle w:val="mord"/>
+          <w:b/>
+          <w:bCs/>
+          <w:sz w:val="28"/>
+          <w:szCs w:val="28"/>
+        </w:rPr>
+        <w:t xml:space="preserve">t </w:t>
+      </w:r>
+      <w:r>
+        <w:rPr>
+          <w:rStyle w:val="mbin"/>
+          <w:b/>
+          <w:bCs/>
+          <w:sz w:val="28"/>
+          <w:szCs w:val="28"/>
+        </w:rPr>
+        <w:t xml:space="preserve">+ </w:t>
+      </w:r>
+      <w:r>
+        <w:rPr>
+          <w:rStyle w:val="mord"/>
+          <w:b/>
+          <w:bCs/>
+          <w:sz w:val="28"/>
+          <w:szCs w:val="28"/>
+        </w:rPr>
+        <w:t>1/2</w:t>
+      </w:r>
+      <w:r>
+        <w:rPr>
+          <w:b/>
+          <w:bCs/>
+          <w:sz w:val="28"/>
+          <w:szCs w:val="28"/>
+        </w:rPr>
+        <w:t xml:space="preserve"> a sin(</w:t>
+      </w:r>
+      <m:oMath>
+        <m:r>
+          <m:rPr>
+            <m:sty m:val="bi"/>
+          </m:rPr>
+          <w:rPr>
+            <w:rStyle w:val="mord"/>
+            <w:rFonts w:ascii="Cambria Math" w:hAnsi="Cambria Math"/>
+            <w:sz w:val="28"/>
+            <w:szCs w:val="28"/>
+            <w:lang w:val="en-US"/>
+          </w:rPr>
+          <m:t>α</m:t>
+        </m:r>
+        <m:r>
+          <m:rPr>
+            <m:sty m:val="bi"/>
+          </m:rPr>
+          <w:rPr>
+            <w:rStyle w:val="mord"/>
+            <w:rFonts w:ascii="Cambria Math" w:hAnsi="Cambria Math"/>
+            <w:sz w:val="28"/>
+            <w:szCs w:val="28"/>
+            <w:lang w:val="uk-UA"/>
+          </w:rPr>
+          <m:t>)</m:t>
+        </m:r>
+      </m:oMath>
+      <w:r>
+        <w:rPr>
+          <w:rStyle w:val="vlist-s"/>
+          <w:b/>
+          <w:bCs/>
+          <w:sz w:val="28"/>
+          <w:szCs w:val="28"/>
+        </w:rPr>
+        <w:t>​</w:t>
+      </w:r>
+      <w:r>
+        <w:rPr>
+          <w:rStyle w:val="mord"/>
+          <w:b/>
+          <w:bCs/>
+          <w:sz w:val="28"/>
+          <w:szCs w:val="28"/>
+        </w:rPr>
+        <w:t>t</w:t>
+      </w:r>
+      <w:r>
+        <w:rPr>
+          <w:rStyle w:val="mord"/>
+          <w:b/>
+          <w:bCs/>
+          <w:sz w:val="28"/>
+          <w:szCs w:val="28"/>
+          <w:vertAlign w:val="superscript"/>
+        </w:rPr>
+        <w:t>2</w:t>
+      </w:r>
+      <w:r>
+        <w:rPr>
+          <w:sz w:val="28"/>
+          <w:szCs w:val="28"/>
+        </w:rPr>
+        <w:t>.</w:t>
       </w:r>
     </w:p>
     <w:p>
@@ -3073,49 +3808,397 @@
           <w:szCs w:val="28"/>
           <w:lang w:val="uk-UA"/>
         </w:rPr>
-        <w:t xml:space="preserve">Виконуючи цю роботу, я покращив знання по моделювання та розрахунку прямолінійного руху тіла. Також навчився працювати з бібліотекою </w:t>
-      </w:r>
-      <w:r>
-        <w:rPr>
+        <w:t xml:space="preserve">Для відображення руху точки спочатку використовую вбудований у </w:t>
+      </w:r>
+      <w:r>
+        <w:rPr>
+          <w:b/>
+          <w:bCs/>
           <w:sz w:val="28"/>
           <w:szCs w:val="28"/>
           <w:lang w:val="en-US"/>
         </w:rPr>
-        <w:t>D</w:t>
-      </w:r>
-      <w:r>
-        <w:rPr>
+        <w:t>HTML</w:t>
+      </w:r>
+      <w:r>
+        <w:rPr>
+          <w:b/>
+          <w:bCs/>
           <w:sz w:val="28"/>
           <w:szCs w:val="28"/>
           <w:lang w:val="ru-RU"/>
         </w:rPr>
+        <w:t xml:space="preserve"> </w:t>
+      </w:r>
+      <w:r>
+        <w:rPr>
+          <w:sz w:val="28"/>
+          <w:szCs w:val="28"/>
+          <w:lang w:val="uk-UA"/>
+        </w:rPr>
+        <w:t xml:space="preserve">тег </w:t>
+      </w:r>
+      <w:r>
+        <w:rPr>
+          <w:b/>
+          <w:bCs/>
+          <w:sz w:val="28"/>
+          <w:szCs w:val="28"/>
+          <w:lang w:val="en-US"/>
+        </w:rPr>
+        <w:t>canva</w:t>
+      </w:r>
+      <w:r>
+        <w:rPr>
+          <w:b/>
+          <w:bCs/>
+          <w:sz w:val="28"/>
+          <w:szCs w:val="28"/>
+          <w:lang w:val="en-US"/>
+        </w:rPr>
+        <w:t>s</w:t>
+      </w:r>
+      <w:r>
+        <w:rPr>
+          <w:b/>
+          <w:bCs/>
+          <w:sz w:val="28"/>
+          <w:szCs w:val="28"/>
+          <w:lang w:val="ru-RU"/>
+        </w:rPr>
+        <w:t xml:space="preserve"> </w:t>
+      </w:r>
+      <w:r>
+        <w:rPr>
+          <w:sz w:val="28"/>
+          <w:szCs w:val="28"/>
+          <w:lang w:val="uk-UA"/>
+        </w:rPr>
+        <w:t>для відображення графіку та прямолінійного руху точки.</w:t>
+      </w:r>
+      <w:r>
+        <w:rPr>
+          <w:sz w:val="28"/>
+          <w:szCs w:val="28"/>
+          <w:lang w:val="ru-RU"/>
+        </w:rPr>
+        <w:t xml:space="preserve"> </w:t>
+      </w:r>
+      <w:r>
+        <w:rPr>
+          <w:sz w:val="28"/>
+          <w:szCs w:val="28"/>
+          <w:lang w:val="uk-UA"/>
+        </w:rPr>
+        <w:t xml:space="preserve"> Приклад вирішення задачі за </w:t>
+      </w:r>
+      <w:proofErr w:type="spellStart"/>
+      <w:r>
+        <w:rPr>
+          <w:sz w:val="28"/>
+          <w:szCs w:val="28"/>
+          <w:lang w:val="uk-UA"/>
+        </w:rPr>
+        <w:t>допомгою</w:t>
+      </w:r>
+      <w:proofErr w:type="spellEnd"/>
+      <w:r>
+        <w:rPr>
+          <w:sz w:val="28"/>
+          <w:szCs w:val="28"/>
+          <w:lang w:val="ru-RU"/>
+        </w:rPr>
+        <w:t xml:space="preserve"> </w:t>
+      </w:r>
+      <w:r>
+        <w:rPr>
+          <w:b/>
+          <w:bCs/>
+          <w:sz w:val="28"/>
+          <w:szCs w:val="28"/>
+          <w:lang w:val="en-US"/>
+        </w:rPr>
+        <w:t>canvas</w:t>
+      </w:r>
+      <w:r>
+        <w:rPr>
+          <w:sz w:val="28"/>
+          <w:szCs w:val="28"/>
+          <w:lang w:val="ru-RU"/>
+        </w:rPr>
+        <w:t xml:space="preserve"> - </w:t>
+      </w:r>
+      <w:hyperlink r:id="rId9" w:anchor="diff-ed3ee7e0beea2498ff3b8ca85973d122fc6fa3d585d62b5807ec034d0cf076b3" w:history="1">
+        <w:r>
+          <w:rPr>
+            <w:rStyle w:val="Hyperlink"/>
+            <w:i/>
+            <w:iCs/>
+            <w:color w:val="1F497D" w:themeColor="text2"/>
+            <w:sz w:val="28"/>
+            <w:szCs w:val="28"/>
+            <w:u w:val="none"/>
+            <w:lang w:val="en-US"/>
+          </w:rPr>
+          <w:t>link</w:t>
+        </w:r>
+      </w:hyperlink>
+    </w:p>
+    <w:p>
+      <w:pPr>
+        <w:spacing w:line="360" w:lineRule="auto"/>
+        <w:ind w:firstLine="708"/>
+        <w:jc w:val="both"/>
+        <w:rPr>
+          <w:i/>
+          <w:iCs/>
+          <w:color w:val="1F497D" w:themeColor="text2"/>
+          <w:sz w:val="28"/>
+          <w:szCs w:val="28"/>
+          <w:lang w:val="uk-UA"/>
+        </w:rPr>
+      </w:pPr>
+      <w:r>
+        <w:rPr>
+          <w:color w:val="000000" w:themeColor="text1"/>
+          <w:sz w:val="28"/>
+          <w:szCs w:val="28"/>
+          <w:lang w:val="uk-UA"/>
+        </w:rPr>
+        <w:t xml:space="preserve">Потім переробляю з </w:t>
+      </w:r>
+      <w:r>
+        <w:rPr>
+          <w:b/>
+          <w:bCs/>
+          <w:color w:val="000000" w:themeColor="text1"/>
+          <w:sz w:val="28"/>
+          <w:szCs w:val="28"/>
+          <w:lang w:val="en-US"/>
+        </w:rPr>
+        <w:t>canvas</w:t>
+      </w:r>
+      <w:r>
+        <w:rPr>
+          <w:b/>
+          <w:bCs/>
+          <w:color w:val="000000" w:themeColor="text1"/>
+          <w:sz w:val="28"/>
+          <w:szCs w:val="28"/>
+          <w:lang w:val="en-US"/>
+        </w:rPr>
+        <w:t xml:space="preserve"> </w:t>
+      </w:r>
+      <w:r>
+        <w:rPr>
+          <w:color w:val="000000" w:themeColor="text1"/>
+          <w:sz w:val="28"/>
+          <w:szCs w:val="28"/>
+          <w:lang w:val="ru-RU"/>
+        </w:rPr>
+        <w:t>на</w:t>
+      </w:r>
+      <w:r>
+        <w:rPr>
+          <w:color w:val="000000" w:themeColor="text1"/>
+          <w:sz w:val="28"/>
+          <w:szCs w:val="28"/>
+          <w:lang w:val="en-US"/>
+        </w:rPr>
+        <w:t xml:space="preserve"> </w:t>
+      </w:r>
+      <w:r>
+        <w:rPr>
+          <w:b/>
+          <w:bCs/>
+          <w:color w:val="000000" w:themeColor="text1"/>
+          <w:sz w:val="28"/>
+          <w:szCs w:val="28"/>
+          <w:lang w:val="en-US"/>
+        </w:rPr>
+        <w:t>d</w:t>
+      </w:r>
+      <w:r>
+        <w:rPr>
+          <w:b/>
+          <w:bCs/>
+          <w:color w:val="000000" w:themeColor="text1"/>
+          <w:sz w:val="28"/>
+          <w:szCs w:val="28"/>
+          <w:lang w:val="en-US"/>
+        </w:rPr>
         <w:t>3.</w:t>
       </w:r>
+      <w:r>
+        <w:rPr>
+          <w:b/>
+          <w:bCs/>
+          <w:color w:val="000000" w:themeColor="text1"/>
+          <w:sz w:val="28"/>
+          <w:szCs w:val="28"/>
+          <w:lang w:val="en-US"/>
+        </w:rPr>
+        <w:t>js</w:t>
+      </w:r>
+      <w:r>
+        <w:rPr>
+          <w:color w:val="000000" w:themeColor="text1"/>
+          <w:sz w:val="28"/>
+          <w:szCs w:val="28"/>
+          <w:lang w:val="en-US"/>
+        </w:rPr>
+        <w:t>(</w:t>
+      </w:r>
+      <w:r>
+        <w:rPr>
+          <w:color w:val="000000" w:themeColor="text1"/>
+          <w:sz w:val="28"/>
+          <w:szCs w:val="28"/>
+          <w:lang w:val="uk-UA"/>
+        </w:rPr>
+        <w:t xml:space="preserve">бібліотека для малювання </w:t>
+      </w:r>
       <w:proofErr w:type="spellStart"/>
       <w:r>
         <w:rPr>
+          <w:color w:val="000000" w:themeColor="text1"/>
+          <w:sz w:val="28"/>
+          <w:szCs w:val="28"/>
+          <w:lang w:val="uk-UA"/>
+        </w:rPr>
+        <w:t>графікфів</w:t>
+      </w:r>
+      <w:proofErr w:type="spellEnd"/>
+      <w:r>
+        <w:rPr>
+          <w:color w:val="000000" w:themeColor="text1"/>
+          <w:sz w:val="28"/>
+          <w:szCs w:val="28"/>
+          <w:lang w:val="uk-UA"/>
+        </w:rPr>
+        <w:t xml:space="preserve">). Приклад вирішення задачі за допомого </w:t>
+      </w:r>
+      <w:r>
+        <w:rPr>
+          <w:b/>
+          <w:bCs/>
+          <w:color w:val="000000" w:themeColor="text1"/>
           <w:sz w:val="28"/>
           <w:szCs w:val="28"/>
           <w:lang w:val="en-US"/>
         </w:rPr>
+        <w:t>d</w:t>
+      </w:r>
+      <w:r>
+        <w:rPr>
+          <w:b/>
+          <w:bCs/>
+          <w:color w:val="000000" w:themeColor="text1"/>
+          <w:sz w:val="28"/>
+          <w:szCs w:val="28"/>
+          <w:lang w:val="en-US"/>
+        </w:rPr>
+        <w:t>3.</w:t>
+      </w:r>
+      <w:r>
+        <w:rPr>
+          <w:b/>
+          <w:bCs/>
+          <w:color w:val="000000" w:themeColor="text1"/>
+          <w:sz w:val="28"/>
+          <w:szCs w:val="28"/>
+          <w:lang w:val="en-US"/>
+        </w:rPr>
         <w:t>js</w:t>
       </w:r>
-      <w:proofErr w:type="spellEnd"/>
-      <w:r>
-        <w:rPr>
-          <w:sz w:val="28"/>
-          <w:szCs w:val="28"/>
-          <w:lang w:val="ru-RU"/>
-        </w:rPr>
-        <w:t xml:space="preserve"> </w:t>
-      </w:r>
-      <w:r>
-        <w:rPr>
+      <w:r>
+        <w:rPr>
+          <w:color w:val="000000" w:themeColor="text1"/>
           <w:sz w:val="28"/>
           <w:szCs w:val="28"/>
           <w:lang w:val="uk-UA"/>
         </w:rPr>
-        <w:t>для побудови графіку.</w:t>
+        <w:t xml:space="preserve"> - </w:t>
+      </w:r>
+      <w:hyperlink r:id="rId10" w:anchor="diff-ed3ee7e0beea2498ff3b8ca85973d122fc6fa3d585d62b5807ec034d0cf076b3" w:history="1">
+        <w:r>
+          <w:rPr>
+            <w:rStyle w:val="Hyperlink"/>
+            <w:i/>
+            <w:iCs/>
+            <w:color w:val="1F497D" w:themeColor="text2"/>
+            <w:sz w:val="28"/>
+            <w:szCs w:val="28"/>
+            <w:u w:val="none"/>
+            <w:lang w:val="en-US"/>
+          </w:rPr>
+          <w:t>lin</w:t>
+        </w:r>
+        <w:r>
+          <w:rPr>
+            <w:rStyle w:val="Hyperlink"/>
+            <w:i/>
+            <w:iCs/>
+            <w:color w:val="1F497D" w:themeColor="text2"/>
+            <w:sz w:val="28"/>
+            <w:szCs w:val="28"/>
+            <w:u w:val="none"/>
+            <w:lang w:val="en-US"/>
+          </w:rPr>
+          <w:t>k</w:t>
+        </w:r>
+      </w:hyperlink>
+    </w:p>
+    <w:p>
+      <w:pPr>
+        <w:spacing w:line="360" w:lineRule="auto"/>
+        <w:ind w:firstLine="708"/>
+        <w:jc w:val="both"/>
+        <w:rPr>
+          <w:sz w:val="28"/>
+          <w:szCs w:val="28"/>
+          <w:lang w:val="uk-UA"/>
+        </w:rPr>
+      </w:pPr>
+      <w:r>
+        <w:rPr>
+          <w:color w:val="000000" w:themeColor="text1"/>
+          <w:sz w:val="28"/>
+          <w:szCs w:val="28"/>
+          <w:lang w:val="uk-UA"/>
+        </w:rPr>
+        <w:t xml:space="preserve">Для виконання цього завдання достатньо використати варіант за допомогою </w:t>
+      </w:r>
+      <w:r>
+        <w:rPr>
+          <w:b/>
+          <w:bCs/>
+          <w:color w:val="000000" w:themeColor="text1"/>
+          <w:sz w:val="28"/>
+          <w:szCs w:val="28"/>
+          <w:lang w:val="en-US"/>
+        </w:rPr>
+        <w:t>canvas</w:t>
+      </w:r>
+      <w:r>
+        <w:rPr>
+          <w:b/>
+          <w:bCs/>
+          <w:color w:val="000000" w:themeColor="text1"/>
+          <w:sz w:val="28"/>
+          <w:szCs w:val="28"/>
+          <w:lang w:val="uk-UA"/>
+        </w:rPr>
+        <w:t xml:space="preserve">. </w:t>
+      </w:r>
+      <w:r>
+        <w:rPr>
+          <w:color w:val="000000" w:themeColor="text1"/>
+          <w:sz w:val="28"/>
+          <w:szCs w:val="28"/>
+          <w:lang w:val="uk-UA"/>
+        </w:rPr>
+        <w:t>Так як відображений графік не я важким, тим паче вбудований метод не потрібно інсталювати, роблячи проект легшим.</w:t>
       </w:r>
     </w:p>
     <w:sectPr>
@@ -4422,6 +5505,7 @@
   <w:style w:type="paragraph" w:default="1" w:styleId="Normal">
     <w:name w:val="Normal"/>
     <w:qFormat/>
+    <w:rsid w:val="00BC787F"/>
   </w:style>
   <w:style w:type="paragraph" w:styleId="Heading1">
     <w:name w:val="heading 1"/>
@@ -4687,6 +5771,81 @@
     <w:rsid w:val="00487FD1"/>
     <w:rPr>
       <w:color w:val="666666"/>
+    </w:rPr>
+  </w:style>
+  <w:style w:type="character" w:customStyle="1" w:styleId="blob-code-inner">
+    <w:name w:val="blob-code-inner"/>
+    <w:basedOn w:val="DefaultParagraphFont"/>
+    <w:rsid w:val="00BC787F"/>
+  </w:style>
+  <w:style w:type="character" w:customStyle="1" w:styleId="pl-k">
+    <w:name w:val="pl-k"/>
+    <w:basedOn w:val="DefaultParagraphFont"/>
+    <w:rsid w:val="00BC787F"/>
+  </w:style>
+  <w:style w:type="character" w:customStyle="1" w:styleId="pl-kos">
+    <w:name w:val="pl-kos"/>
+    <w:basedOn w:val="DefaultParagraphFont"/>
+    <w:rsid w:val="00BC787F"/>
+  </w:style>
+  <w:style w:type="character" w:customStyle="1" w:styleId="pl-smi">
+    <w:name w:val="pl-smi"/>
+    <w:basedOn w:val="DefaultParagraphFont"/>
+    <w:rsid w:val="00BC787F"/>
+  </w:style>
+  <w:style w:type="character" w:customStyle="1" w:styleId="pl-c1">
+    <w:name w:val="pl-c1"/>
+    <w:basedOn w:val="DefaultParagraphFont"/>
+    <w:rsid w:val="00BC787F"/>
+  </w:style>
+  <w:style w:type="character" w:customStyle="1" w:styleId="pl-s1">
+    <w:name w:val="pl-s1"/>
+    <w:basedOn w:val="DefaultParagraphFont"/>
+    <w:rsid w:val="00BC787F"/>
+  </w:style>
+  <w:style w:type="character" w:customStyle="1" w:styleId="pl-v">
+    <w:name w:val="pl-v"/>
+    <w:basedOn w:val="DefaultParagraphFont"/>
+    <w:rsid w:val="00BC787F"/>
+  </w:style>
+  <w:style w:type="character" w:customStyle="1" w:styleId="pl-en">
+    <w:name w:val="pl-en"/>
+    <w:basedOn w:val="DefaultParagraphFont"/>
+    <w:rsid w:val="00BC787F"/>
+  </w:style>
+  <w:style w:type="character" w:styleId="Hyperlink">
+    <w:name w:val="Hyperlink"/>
+    <w:basedOn w:val="DefaultParagraphFont"/>
+    <w:uiPriority w:val="99"/>
+    <w:unhideWhenUsed/>
+    <w:rsid w:val="00BC787F"/>
+    <w:rPr>
+      <w:color w:val="0000FF" w:themeColor="hyperlink"/>
+      <w:u w:val="single"/>
+    </w:rPr>
+  </w:style>
+  <w:style w:type="character" w:styleId="UnresolvedMention">
+    <w:name w:val="Unresolved Mention"/>
+    <w:basedOn w:val="DefaultParagraphFont"/>
+    <w:uiPriority w:val="99"/>
+    <w:semiHidden/>
+    <w:unhideWhenUsed/>
+    <w:rsid w:val="00BC787F"/>
+    <w:rPr>
+      <w:color w:val="605E5C"/>
+      <w:shd w:val="clear" w:color="auto" w:fill="E1DFDD"/>
+    </w:rPr>
+  </w:style>
+  <w:style w:type="character" w:styleId="FollowedHyperlink">
+    <w:name w:val="FollowedHyperlink"/>
+    <w:basedOn w:val="DefaultParagraphFont"/>
+    <w:uiPriority w:val="99"/>
+    <w:semiHidden/>
+    <w:unhideWhenUsed/>
+    <w:rsid w:val="0008408A"/>
+    <w:rPr>
+      <w:color w:val="800080" w:themeColor="followedHyperlink"/>
+      <w:u w:val="single"/>
     </w:rPr>
   </w:style>
 </w:styles>

</xml_diff>